<commit_message>
docs: add monitoring architecture overview and guest OS collector section to setup guide
Adds three-layer monitoring architecture table (Container Monitoring,
KubeVirt DataSources, Collector on VM) with VMware comparison. Adds
Section 16 covering optional LM Collector installation inside KubeVirt
VMs for guest OS visibility.
</commit_message>
<xml_diff>
--- a/documentation/KubeVirt_Monitoring_Setup_Guide.docx
+++ b/documentation/KubeVirt_Monitoring_Setup_Guide.docx
@@ -68,72 +68,82 @@
     </w:p>
     <w:p>
       <w:r>
-        <w:t>2. What You Need Before Starting</w:t>
+        <w:t>2. Monitoring Architecture Overview</w:t>
       </w:r>
     </w:p>
     <w:p>
       <w:r>
-        <w:t>3. Step 1: Verify Your OpenShift Environment</w:t>
+        <w:t>3. What You Need Before Starting</w:t>
       </w:r>
     </w:p>
     <w:p>
       <w:r>
-        <w:t>4. Step 2: Find the Thanos Querier Endpoint</w:t>
+        <w:t>4. Step 1: Verify Your OpenShift Environment</w:t>
       </w:r>
     </w:p>
     <w:p>
       <w:r>
-        <w:t>5. Step 3: Create a Service Account for LogicMonitor</w:t>
+        <w:t>5. Step 2: Find the Thanos Querier Endpoint</w:t>
       </w:r>
     </w:p>
     <w:p>
       <w:r>
-        <w:t>6. Step 4: Generate a Bearer Token</w:t>
+        <w:t>6. Step 3: Create a Service Account for LogicMonitor</w:t>
       </w:r>
     </w:p>
     <w:p>
       <w:r>
-        <w:t>7. Step 5: Test the Connection</w:t>
+        <w:t>7. Step 4: Generate a Bearer Token</w:t>
       </w:r>
     </w:p>
     <w:p>
       <w:r>
-        <w:t>8. Step 6: Import DataSources into LogicMonitor</w:t>
+        <w:t>8. Step 5: Test the Connection</w:t>
       </w:r>
     </w:p>
     <w:p>
       <w:r>
-        <w:t>9. Step 7: Create the Monitoring Device in LogicMonitor</w:t>
+        <w:t>9. Step 6: Import DataSources into LogicMonitor</w:t>
       </w:r>
     </w:p>
     <w:p>
       <w:r>
-        <w:t>10. Step 8: Set Device Properties</w:t>
+        <w:t>10. Step 7: Create the Monitoring Device in LogicMonitor</w:t>
       </w:r>
     </w:p>
     <w:p>
       <w:r>
-        <w:t>11. Step 9: Verify Everything Works</w:t>
+        <w:t>11. Step 8: Set Device Properties</w:t>
       </w:r>
     </w:p>
     <w:p>
       <w:r>
-        <w:t>12. What Gets Monitored</w:t>
+        <w:t>12. Step 9: Verify Everything Works</w:t>
       </w:r>
     </w:p>
     <w:p>
       <w:r>
-        <w:t>13. Monitoring Multiple Clusters</w:t>
+        <w:t>13. What Gets Monitored</w:t>
       </w:r>
     </w:p>
     <w:p>
       <w:r>
-        <w:t>14. Token Rotation</w:t>
+        <w:t>14. Monitoring Multiple Clusters</w:t>
       </w:r>
     </w:p>
     <w:p>
       <w:r>
-        <w:t>15. Troubleshooting</w:t>
+        <w:t>15. Token Rotation</w:t>
+      </w:r>
+    </w:p>
+    <w:p>
+      <w:r>
+        <w:t>16. Optional: Guest OS Monitoring with LM Collectors</w:t>
+      </w:r>
+    </w:p>
+    <w:p>
+      <w:r>
+        <w:t>17. Troubleshooting</w:t>
       </w:r>
     </w:p>
     <w:p>
@@ -155,7 +165,7 @@
           <w:b w:val="0"/>
           <w:i w:val="0"/>
         </w:rPr>
-        <w:t>This guide walks you through setting up LogicMonitor to monitor your OpenShift Virtualization (KubeVirt) virtual machines. By the end, LogicMonitor will automatically discover all your VMs and collect CPU, memory, network, and storage metrics for each one.</w:t>
+        <w:t>This guide walks you through setting up LogicMonitor to monitor your OpenShift Virtualization (KubeVirt) virtual machines at the platform level. By the end, LogicMonitor will automatically discover all your VMs and collect CPU, memory, network, and storage metrics for each one from the hypervisor perspective.</w:t>
       </w:r>
     </w:p>
     <w:p>
@@ -211,19 +221,351 @@
       </w:r>
     </w:p>
     <w:p>
-      <w:pPr>
-        <w:pStyle w:val="Heading1"/>
-      </w:pPr>
       <w:r>
-        <w:t>2. What You Need Before Starting</w:t>
+        <w:rPr>
+          <w:b/>
+          <w:color w:val="0070C0"/>
+        </w:rPr>
+        <w:t xml:space="preserve">Note: </w:t>
+      </w:r>
+      <w:r>
+        <w:rPr>
+          <w:color w:val="0070C0"/>
+        </w:rPr>
+        <w:t>This guide covers the KubeVirt platform monitoring layer (see Section 2 for the full architecture). For guest OS monitoring inside individual VMs, see Section 16.</w:t>
       </w:r>
     </w:p>
     <w:p>
       <w:pPr>
+        <w:pStyle w:val="Heading1"/>
+      </w:pPr>
+      <w:r>
+        <w:t>2. Monitoring Architecture Overview</w:t>
+      </w:r>
+    </w:p>
+    <w:p>
+      <w:r>
+        <w:rPr>
+          <w:b w:val="0"/>
+          <w:i w:val="0"/>
+        </w:rPr>
+        <w:t>Full observability of OpenShift Virtualization requires up to three monitoring layers, each providing a different level of visibility. This mirrors how VMware environments are monitored with LogicMonitor: ESXi host monitoring, vCenter DataSources, and a Collector on each VM.</w:t>
+      </w:r>
+    </w:p>
+    <w:tbl>
+      <w:tblPr>
+        <w:tblStyle w:val="LightGrid-Accent1"/>
+        <w:tblW w:type="auto" w:w="0"/>
+        <w:jc w:val="left"/>
+        <w:tblLook w:firstColumn="1" w:firstRow="1" w:lastColumn="0" w:lastRow="0" w:noHBand="0" w:noVBand="1" w:val="04A0"/>
+      </w:tblPr>
+      <w:tblGrid>
+        <w:gridCol w:w="2160"/>
+        <w:gridCol w:w="2160"/>
+        <w:gridCol w:w="2160"/>
+        <w:gridCol w:w="2160"/>
+      </w:tblGrid>
+      <w:tr>
+        <w:tc>
+          <w:tcPr>
+            <w:tcW w:type="dxa" w:w="2160"/>
+          </w:tcPr>
+          <w:p>
+            <w:r>
+              <w:rPr>
+                <w:b/>
+                <w:sz w:val="20"/>
+              </w:rPr>
+              <w:t>Layer</w:t>
+            </w:r>
+          </w:p>
+        </w:tc>
+        <w:tc>
+          <w:tcPr>
+            <w:tcW w:type="dxa" w:w="2160"/>
+          </w:tcPr>
+          <w:p>
+            <w:r>
+              <w:rPr>
+                <w:b/>
+                <w:sz w:val="20"/>
+              </w:rPr>
+              <w:t>What It Monitors</w:t>
+            </w:r>
+          </w:p>
+        </w:tc>
+        <w:tc>
+          <w:tcPr>
+            <w:tcW w:type="dxa" w:w="2160"/>
+          </w:tcPr>
+          <w:p>
+            <w:r>
+              <w:rPr>
+                <w:b/>
+                <w:sz w:val="20"/>
+              </w:rPr>
+              <w:t>How It Works</w:t>
+            </w:r>
+          </w:p>
+        </w:tc>
+        <w:tc>
+          <w:tcPr>
+            <w:tcW w:type="dxa" w:w="2160"/>
+          </w:tcPr>
+          <w:p>
+            <w:r>
+              <w:rPr>
+                <w:b/>
+                <w:sz w:val="20"/>
+              </w:rPr>
+              <w:t>LM Licensing</w:t>
+            </w:r>
+          </w:p>
+        </w:tc>
+      </w:tr>
+      <w:tr>
+        <w:tc>
+          <w:tcPr>
+            <w:tcW w:type="dxa" w:w="2160"/>
+          </w:tcPr>
+          <w:p>
+            <w:r>
+              <w:rPr>
+                <w:sz w:val="20"/>
+              </w:rPr>
+              <w:t>Container Monitoring</w:t>
+              <w:br/>
+              <w:t>(LM Container / Helm)</w:t>
+            </w:r>
+          </w:p>
+        </w:tc>
+        <w:tc>
+          <w:tcPr>
+            <w:tcW w:type="dxa" w:w="2160"/>
+          </w:tcPr>
+          <w:p>
+            <w:r>
+              <w:rPr>
+                <w:sz w:val="20"/>
+              </w:rPr>
+              <w:t>The OpenShift cluster itself: nodes, pods, namespaces, the virt-launcher pods that host each VM</w:t>
+            </w:r>
+          </w:p>
+        </w:tc>
+        <w:tc>
+          <w:tcPr>
+            <w:tcW w:type="dxa" w:w="2160"/>
+          </w:tcPr>
+          <w:p>
+            <w:r>
+              <w:rPr>
+                <w:sz w:val="20"/>
+              </w:rPr>
+              <w:t>Containerized Collector deployed via Helm chart (Argus) queries the Kubernetes API</w:t>
+            </w:r>
+          </w:p>
+        </w:tc>
+        <w:tc>
+          <w:tcPr>
+            <w:tcW w:type="dxa" w:w="2160"/>
+          </w:tcPr>
+          <w:p>
+            <w:r>
+              <w:rPr>
+                <w:sz w:val="20"/>
+              </w:rPr>
+              <w:t>Per LM Container</w:t>
+              <w:br/>
+              <w:t>licensing</w:t>
+            </w:r>
+          </w:p>
+        </w:tc>
+      </w:tr>
+      <w:tr>
+        <w:tc>
+          <w:tcPr>
+            <w:tcW w:type="dxa" w:w="2160"/>
+          </w:tcPr>
+          <w:p>
+            <w:r>
+              <w:rPr>
+                <w:sz w:val="20"/>
+              </w:rPr>
+              <w:t>KubeVirt DataSources</w:t>
+              <w:br/>
+              <w:t>(this guide)</w:t>
+            </w:r>
+          </w:p>
+        </w:tc>
+        <w:tc>
+          <w:tcPr>
+            <w:tcW w:type="dxa" w:w="2160"/>
+          </w:tcPr>
+          <w:p>
+            <w:r>
+              <w:rPr>
+                <w:sz w:val="20"/>
+              </w:rPr>
+              <w:t>The virtualization platform: VM lifecycle, state, migrations, hypervisor-level CPU, memory, network, and storage per VM</w:t>
+            </w:r>
+          </w:p>
+        </w:tc>
+        <w:tc>
+          <w:tcPr>
+            <w:tcW w:type="dxa" w:w="2160"/>
+          </w:tcPr>
+          <w:p>
+            <w:r>
+              <w:rPr>
+                <w:sz w:val="20"/>
+              </w:rPr>
+              <w:t>LM Collector queries Thanos Querier via PromQL over HTTPS. 1 device per cluster, VMs appear as instances</w:t>
+            </w:r>
+          </w:p>
+        </w:tc>
+        <w:tc>
+          <w:tcPr>
+            <w:tcW w:type="dxa" w:w="2160"/>
+          </w:tcPr>
+          <w:p>
+            <w:r>
+              <w:rPr>
+                <w:sz w:val="20"/>
+              </w:rPr>
+              <w:t>1 device per cluster</w:t>
+            </w:r>
+          </w:p>
+        </w:tc>
+      </w:tr>
+      <w:tr>
+        <w:tc>
+          <w:tcPr>
+            <w:tcW w:type="dxa" w:w="2160"/>
+          </w:tcPr>
+          <w:p>
+            <w:r>
+              <w:rPr>
+                <w:sz w:val="20"/>
+              </w:rPr>
+              <w:t>Collector on VM</w:t>
+              <w:br/>
+              <w:t>(optional, Section 16)</w:t>
+            </w:r>
+          </w:p>
+        </w:tc>
+        <w:tc>
+          <w:tcPr>
+            <w:tcW w:type="dxa" w:w="2160"/>
+          </w:tcPr>
+          <w:p>
+            <w:r>
+              <w:rPr>
+                <w:sz w:val="20"/>
+              </w:rPr>
+              <w:t>Guest OS inside each VM: processes, services, disk, logs, application metrics</w:t>
+            </w:r>
+          </w:p>
+        </w:tc>
+        <w:tc>
+          <w:tcPr>
+            <w:tcW w:type="dxa" w:w="2160"/>
+          </w:tcPr>
+          <w:p>
+            <w:r>
+              <w:rPr>
+                <w:sz w:val="20"/>
+              </w:rPr>
+              <w:t>Standard LM Collector installed inside the VM, identical to any traditional Linux or Windows server</w:t>
+            </w:r>
+          </w:p>
+        </w:tc>
+        <w:tc>
+          <w:tcPr>
+            <w:tcW w:type="dxa" w:w="2160"/>
+          </w:tcPr>
+          <w:p>
+            <w:r>
+              <w:rPr>
+                <w:sz w:val="20"/>
+              </w:rPr>
+              <w:t>1 device per VM</w:t>
+            </w:r>
+          </w:p>
+        </w:tc>
+      </w:tr>
+    </w:tbl>
+    <w:p/>
+    <w:p>
+      <w:r>
+        <w:rPr>
+          <w:b/>
+          <w:i w:val="0"/>
+        </w:rPr>
+        <w:t>What each layer sees that the others cannot:</w:t>
+      </w:r>
+    </w:p>
+    <w:p>
+      <w:pPr>
+        <w:pStyle w:val="ListBullet"/>
+      </w:pPr>
+      <w:r>
+        <w:t>Container Monitoring: Detects when a virt-launcher pod crashes, node resource pressure, or scheduling failures at the Kubernetes level</w:t>
+      </w:r>
+    </w:p>
+    <w:p>
+      <w:pPr>
+        <w:pStyle w:val="ListBullet"/>
+      </w:pPr>
+      <w:r>
+        <w:t>KubeVirt DataSources: Detects VM migration events, VMs stuck in Scheduling/Pending state, hypervisor-level resource consumption across the entire fleet</w:t>
+      </w:r>
+    </w:p>
+    <w:p>
+      <w:pPr>
+        <w:pStyle w:val="ListBullet"/>
+      </w:pPr>
+      <w:r>
+        <w:t>Collector on VM: Detects a crashed database process, a filling disk, a failed service, or application-level errors inside the guest OS</w:t>
+      </w:r>
+    </w:p>
+    <w:p/>
+    <w:p>
+      <w:r>
+        <w:rPr>
+          <w:b w:val="0"/>
+          <w:i w:val="0"/>
+        </w:rPr>
+        <w:t>Without any one of these layers, there is a blind spot. For example, a Collector inside a VM cannot report anything if the VM itself fails to boot -- only the KubeVirt DataSources would detect that the VM is stuck in a failed state.</w:t>
+      </w:r>
+    </w:p>
+    <w:p>
+      <w:r>
+        <w:rPr>
+          <w:b w:val="0"/>
+          <w:i w:val="0"/>
+        </w:rPr>
+        <w:t>This guide covers the KubeVirt DataSources layer (the middle row). Container Monitoring is set up separately using the LM Container Helm chart. Guest OS monitoring is covered in Section 16 as an optional add-on.</w:t>
+      </w:r>
+    </w:p>
+    <w:p>
+      <w:r>
+        <w:br w:type="page"/>
+      </w:r>
+    </w:p>
+    <w:p>
+      <w:pPr>
+        <w:pStyle w:val="Heading1"/>
+      </w:pPr>
+      <w:r>
+        <w:t>3. What You Need Before Starting</w:t>
+      </w:r>
+    </w:p>
+    <w:p>
+      <w:pPr>
         <w:pStyle w:val="Heading2"/>
       </w:pPr>
       <w:r>
-        <w:t>OpenShift Requirements</w:t>
+        <w:t>3.1 OpenShift Requirements</w:t>
       </w:r>
     </w:p>
     <w:p>
@@ -271,7 +613,7 @@
         <w:pStyle w:val="Heading2"/>
       </w:pPr>
       <w:r>
-        <w:t>LogicMonitor Requirements</w:t>
+        <w:t>3.2 LogicMonitor Requirements</w:t>
       </w:r>
     </w:p>
     <w:p>
@@ -303,7 +645,7 @@
         <w:pStyle w:val="Heading2"/>
       </w:pPr>
       <w:r>
-        <w:t>Network Requirements</w:t>
+        <w:t>3.3 Network Requirements</w:t>
       </w:r>
     </w:p>
     <w:p>
@@ -355,7 +697,7 @@
         <w:pStyle w:val="Heading1"/>
       </w:pPr>
       <w:r>
-        <w:t>3. Step 1: Verify Your OpenShift Environment</w:t>
+        <w:t>4. Step 1: Verify Your OpenShift Environment</w:t>
       </w:r>
     </w:p>
     <w:p>
@@ -372,7 +714,7 @@
         <w:pStyle w:val="Heading2"/>
       </w:pPr>
       <w:r>
-        <w:t>3.1 Log in to your OpenShift cluster</w:t>
+        <w:t>4.1 Log in to your OpenShift cluster</w:t>
       </w:r>
     </w:p>
     <w:p>
@@ -411,7 +753,7 @@
         <w:pStyle w:val="Heading2"/>
       </w:pPr>
       <w:r>
-        <w:t>3.2 Verify OpenShift Virtualization is installed</w:t>
+        <w:t>4.2 Verify OpenShift Virtualization is installed</w:t>
       </w:r>
     </w:p>
     <w:p>
@@ -481,7 +823,7 @@
         <w:pStyle w:val="Heading2"/>
       </w:pPr>
       <w:r>
-        <w:t>3.3 Verify you have running VMs</w:t>
+        <w:t>4.3 Verify you have running VMs</w:t>
       </w:r>
     </w:p>
     <w:p>
@@ -540,7 +882,7 @@
         <w:pStyle w:val="Heading1"/>
       </w:pPr>
       <w:r>
-        <w:t>4. Step 2: Find the Thanos Querier Endpoint</w:t>
+        <w:t>5. Step 2: Find the Thanos Querier Endpoint</w:t>
       </w:r>
     </w:p>
     <w:p>
@@ -654,7 +996,7 @@
         <w:pStyle w:val="Heading1"/>
       </w:pPr>
       <w:r>
-        <w:t>5. Step 3: Create a Service Account for LogicMonitor</w:t>
+        <w:t>6. Step 3: Create a Service Account for LogicMonitor</w:t>
       </w:r>
     </w:p>
     <w:p>
@@ -695,7 +1037,7 @@
         <w:pStyle w:val="Heading2"/>
       </w:pPr>
       <w:r>
-        <w:t>5.1 Create the service account</w:t>
+        <w:t>6.1 Create the service account</w:t>
       </w:r>
     </w:p>
     <w:p>
@@ -716,7 +1058,7 @@
         <w:pStyle w:val="Heading2"/>
       </w:pPr>
       <w:r>
-        <w:t>5.2 Grant read-only monitoring access</w:t>
+        <w:t>6.2 Grant read-only monitoring access</w:t>
       </w:r>
     </w:p>
     <w:p>
@@ -768,7 +1110,7 @@
         <w:pStyle w:val="Heading1"/>
       </w:pPr>
       <w:r>
-        <w:t>6. Step 4: Generate a Bearer Token</w:t>
+        <w:t>7. Step 4: Generate a Bearer Token</w:t>
       </w:r>
     </w:p>
     <w:p>
@@ -968,7 +1310,7 @@
         <w:rPr>
           <w:color w:val="0070C0"/>
         </w:rPr>
-        <w:t>Some clusters may enforce a maximum token lifetime. If 8760h is rejected, try a shorter duration. Set a calendar reminder to rotate the token before it expires (see Section 14).</w:t>
+        <w:t>Some clusters may enforce a maximum token lifetime. If 8760h is rejected, try a shorter duration. Set a calendar reminder to rotate the token before it expires (see Section 15).</w:t>
       </w:r>
     </w:p>
     <w:p>
@@ -976,7 +1318,7 @@
         <w:pStyle w:val="Heading1"/>
       </w:pPr>
       <w:r>
-        <w:t>7. Step 5: Test the Connection</w:t>
+        <w:t>8. Step 5: Test the Connection</w:t>
       </w:r>
     </w:p>
     <w:p>
@@ -1286,7 +1628,7 @@
         <w:pStyle w:val="Heading1"/>
       </w:pPr>
       <w:r>
-        <w:t>8. Step 6: Import DataSources into LogicMonitor</w:t>
+        <w:t>9. Step 6: Import DataSources into LogicMonitor</w:t>
       </w:r>
     </w:p>
     <w:p>
@@ -1596,7 +1938,7 @@
         <w:pStyle w:val="Heading1"/>
       </w:pPr>
       <w:r>
-        <w:t>9. Step 7: Create the Monitoring Device in LogicMonitor</w:t>
+        <w:t>10. Step 7: Create the Monitoring Device in LogicMonitor</w:t>
       </w:r>
     </w:p>
     <w:p>
@@ -1823,7 +2165,7 @@
         <w:pStyle w:val="Heading1"/>
       </w:pPr>
       <w:r>
-        <w:t>10. Step 8: Set Device Properties</w:t>
+        <w:t>11. Step 8: Set Device Properties</w:t>
       </w:r>
     </w:p>
     <w:p>
@@ -2208,7 +2550,7 @@
         <w:pStyle w:val="Heading1"/>
       </w:pPr>
       <w:r>
-        <w:t>11. Step 9: Verify Everything Works</w:t>
+        <w:t>12. Step 9: Verify Everything Works</w:t>
       </w:r>
     </w:p>
     <w:p>
@@ -2216,7 +2558,7 @@
         <w:pStyle w:val="Heading2"/>
       </w:pPr>
       <w:r>
-        <w:t>11.1 Check DataSources are attached</w:t>
+        <w:t>12.1 Check DataSources are attached</w:t>
       </w:r>
     </w:p>
     <w:p>
@@ -2257,7 +2599,7 @@
         <w:pStyle w:val="Heading2"/>
       </w:pPr>
       <w:r>
-        <w:t>11.2 Trigger Active Discovery</w:t>
+        <w:t>12.2 Trigger Active Discovery</w:t>
       </w:r>
     </w:p>
     <w:p>
@@ -2331,7 +2673,7 @@
         <w:pStyle w:val="Heading2"/>
       </w:pPr>
       <w:r>
-        <w:t>11.3 Verify data collection</w:t>
+        <w:t>12.3 Verify data collection</w:t>
       </w:r>
     </w:p>
     <w:p>
@@ -2400,7 +2742,7 @@
         <w:pStyle w:val="Heading1"/>
       </w:pPr>
       <w:r>
-        <w:t>12. What Gets Monitored</w:t>
+        <w:t>13. What Gets Monitored</w:t>
       </w:r>
     </w:p>
     <w:p>
@@ -3954,7 +4296,7 @@
         <w:pStyle w:val="Heading1"/>
       </w:pPr>
       <w:r>
-        <w:t>13. Monitoring Multiple Clusters</w:t>
+        <w:t>14. Monitoring Multiple Clusters</w:t>
       </w:r>
     </w:p>
     <w:p>
@@ -4193,7 +4535,7 @@
         <w:pStyle w:val="Heading1"/>
       </w:pPr>
       <w:r>
-        <w:t>14. Token Rotation</w:t>
+        <w:t>15. Token Rotation</w:t>
       </w:r>
     </w:p>
     <w:p>
@@ -4210,7 +4552,7 @@
         <w:pStyle w:val="Heading2"/>
       </w:pPr>
       <w:r>
-        <w:t>14.1 Check when your token expires</w:t>
+        <w:t>15.1 Check when your token expires</w:t>
       </w:r>
     </w:p>
     <w:p>
@@ -4266,7 +4608,7 @@
         <w:pStyle w:val="Heading2"/>
       </w:pPr>
       <w:r>
-        <w:t>14.2 Generate a new token</w:t>
+        <w:t>15.2 Generate a new token</w:t>
       </w:r>
     </w:p>
     <w:p>
@@ -4291,7 +4633,7 @@
         <w:pStyle w:val="Heading2"/>
       </w:pPr>
       <w:r>
-        <w:t>14.3 Update LogicMonitor</w:t>
+        <w:t>15.3 Update LogicMonitor</w:t>
       </w:r>
     </w:p>
     <w:p>
@@ -4376,7 +4718,270 @@
         <w:pStyle w:val="Heading1"/>
       </w:pPr>
       <w:r>
-        <w:t>15. Troubleshooting</w:t>
+        <w:t>16. Optional: Guest OS Monitoring with LM Collectors</w:t>
+      </w:r>
+    </w:p>
+    <w:p>
+      <w:r>
+        <w:rPr>
+          <w:b w:val="0"/>
+          <w:i w:val="0"/>
+        </w:rPr>
+        <w:t>The KubeVirt DataSources configured in this guide monitor VMs from the hypervisor perspective -- CPU, memory, network, and storage as reported by the KubeVirt/libvirt layer. For visibility into what is happening inside the guest operating system (processes, services, application metrics, disk health, logs), you can install a standard LogicMonitor Collector directly inside each VM.</w:t>
+      </w:r>
+    </w:p>
+    <w:p>
+      <w:r>
+        <w:rPr>
+          <w:b w:val="0"/>
+          <w:i w:val="0"/>
+        </w:rPr>
+        <w:t>KubeVirt VMs run real operating systems (RHEL, Windows, Ubuntu, etc.) on KVM/QEMU. From inside the VM, it is indistinguishable from a traditional bare-metal or VMware VM. A standard LM Collector installation works identically.</w:t>
+      </w:r>
+    </w:p>
+    <w:p>
+      <w:pPr>
+        <w:pStyle w:val="Heading2"/>
+      </w:pPr>
+      <w:r>
+        <w:t>16.1 Requirements</w:t>
+      </w:r>
+    </w:p>
+    <w:p>
+      <w:pPr>
+        <w:pStyle w:val="ListBullet"/>
+      </w:pPr>
+      <w:r>
+        <w:t>The VM must run a supported 64-bit operating system (Linux or Windows)</w:t>
+      </w:r>
+    </w:p>
+    <w:p>
+      <w:pPr>
+        <w:pStyle w:val="ListBullet"/>
+      </w:pPr>
+      <w:r>
+        <w:t>Minimum 2 GB of available RAM for the Collector process</w:t>
+      </w:r>
+    </w:p>
+    <w:p>
+      <w:pPr>
+        <w:pStyle w:val="ListBullet"/>
+      </w:pPr>
+      <w:r>
+        <w:t>Outbound HTTPS access (port 443) to your LogicMonitor portal (e.g., yourcompany.logicmonitor.com)</w:t>
+      </w:r>
+    </w:p>
+    <w:p>
+      <w:pPr>
+        <w:pStyle w:val="ListBullet"/>
+      </w:pPr>
+      <w:r>
+        <w:t>The VM does NOT need a routable IP or secondary network -- the default pod network provides outbound internet access</w:t>
+      </w:r>
+    </w:p>
+    <w:p>
+      <w:pPr>
+        <w:pStyle w:val="Heading2"/>
+      </w:pPr>
+      <w:r>
+        <w:t>16.2 Installation Steps</w:t>
+      </w:r>
+    </w:p>
+    <w:p>
+      <w:pPr>
+        <w:pStyle w:val="ListNumber"/>
+      </w:pPr>
+      <w:r>
+        <w:t>In your LogicMonitor portal, navigate to Settings &gt; Collectors &gt; Add Collector</w:t>
+      </w:r>
+    </w:p>
+    <w:p>
+      <w:pPr>
+        <w:pStyle w:val="ListNumber"/>
+      </w:pPr>
+      <w:r>
+        <w:t>Select the operating system matching your VM (Linux 64-bit or Windows 64-bit)</w:t>
+      </w:r>
+    </w:p>
+    <w:p>
+      <w:pPr>
+        <w:pStyle w:val="ListNumber"/>
+      </w:pPr>
+      <w:r>
+        <w:t>Choose a Collector size based on what the Collector will monitor (Small is fine if it only monitors itself)</w:t>
+      </w:r>
+    </w:p>
+    <w:p>
+      <w:pPr>
+        <w:pStyle w:val="ListNumber"/>
+      </w:pPr>
+      <w:r>
+        <w:t>Download the installer or copy the download command</w:t>
+      </w:r>
+    </w:p>
+    <w:p>
+      <w:pPr>
+        <w:pStyle w:val="ListNumber"/>
+      </w:pPr>
+      <w:r>
+        <w:t>Access the VM console using virtctl or SSH:</w:t>
+        <w:br/>
+        <w:t xml:space="preserve">    virtctl console &lt;vm-name&gt; -n &lt;namespace&gt;</w:t>
+        <w:br/>
+        <w:t xml:space="preserve">    or: ssh user@&lt;vm-ip&gt;</w:t>
+      </w:r>
+    </w:p>
+    <w:p>
+      <w:pPr>
+        <w:pStyle w:val="ListNumber"/>
+      </w:pPr>
+      <w:r>
+        <w:t>Run the Collector installer inside the VM following the on-screen instructions</w:t>
+      </w:r>
+    </w:p>
+    <w:p>
+      <w:pPr>
+        <w:pStyle w:val="ListNumber"/>
+      </w:pPr>
+      <w:r>
+        <w:t>Once installed, the VM will appear as a new device in LogicMonitor within a few minutes</w:t>
+      </w:r>
+    </w:p>
+    <w:p>
+      <w:pPr>
+        <w:pStyle w:val="Heading2"/>
+      </w:pPr>
+      <w:r>
+        <w:t>16.3 What You Gain</w:t>
+      </w:r>
+    </w:p>
+    <w:p>
+      <w:r>
+        <w:rPr>
+          <w:b w:val="0"/>
+          <w:i w:val="0"/>
+        </w:rPr>
+        <w:t>With a Collector inside the VM, LogicMonitor's full module library applies:</w:t>
+      </w:r>
+    </w:p>
+    <w:p>
+      <w:pPr>
+        <w:pStyle w:val="ListBullet"/>
+      </w:pPr>
+      <w:r>
+        <w:t>Linux: CPU, memory, disk, network, process monitoring, syslog, file system, etc.</w:t>
+      </w:r>
+    </w:p>
+    <w:p>
+      <w:pPr>
+        <w:pStyle w:val="ListBullet"/>
+      </w:pPr>
+      <w:r>
+        <w:t>Windows: CPU, memory, disk, network, services, event log, IIS, SQL Server, etc.</w:t>
+      </w:r>
+    </w:p>
+    <w:p>
+      <w:pPr>
+        <w:pStyle w:val="ListBullet"/>
+      </w:pPr>
+      <w:r>
+        <w:t>Applications: Any application-specific DataSources (databases, web servers, middleware)</w:t>
+      </w:r>
+    </w:p>
+    <w:p>
+      <w:pPr>
+        <w:pStyle w:val="ListBullet"/>
+      </w:pPr>
+      <w:r>
+        <w:t>Custom: Script-based DataSources for application-specific health checks</w:t>
+      </w:r>
+    </w:p>
+    <w:p>
+      <w:pPr>
+        <w:pStyle w:val="Heading2"/>
+      </w:pPr>
+      <w:r>
+        <w:t>16.4 Licensing Considerations</w:t>
+      </w:r>
+    </w:p>
+    <w:p>
+      <w:r>
+        <w:rPr>
+          <w:b w:val="0"/>
+          <w:i w:val="0"/>
+        </w:rPr>
+        <w:t>Each VM with a Collector installed counts as 1 additional device in your LogicMonitor license. This is separate from the 1-device-per-cluster cost of the KubeVirt platform DataSources. For example, monitoring a cluster with 20 VMs where 5 have Collectors installed would use 6 total device licenses: 1 for the KubeVirt platform device and 5 for the individual VMs.</w:t>
+      </w:r>
+    </w:p>
+    <w:p>
+      <w:pPr>
+        <w:pStyle w:val="Heading2"/>
+      </w:pPr>
+      <w:r>
+        <w:t>16.5 When to Use This</w:t>
+      </w:r>
+    </w:p>
+    <w:p>
+      <w:r>
+        <w:rPr>
+          <w:b w:val="0"/>
+          <w:i w:val="0"/>
+        </w:rPr>
+        <w:t>Install Collectors on VMs when you need to:</w:t>
+      </w:r>
+    </w:p>
+    <w:p>
+      <w:pPr>
+        <w:pStyle w:val="ListBullet"/>
+      </w:pPr>
+      <w:r>
+        <w:t>Monitor specific processes or services running inside the VM</w:t>
+      </w:r>
+    </w:p>
+    <w:p>
+      <w:pPr>
+        <w:pStyle w:val="ListBullet"/>
+      </w:pPr>
+      <w:r>
+        <w:t>Collect application-level metrics (database queries, web server response times)</w:t>
+      </w:r>
+    </w:p>
+    <w:p>
+      <w:pPr>
+        <w:pStyle w:val="ListBullet"/>
+      </w:pPr>
+      <w:r>
+        <w:t>Monitor log files inside the guest OS</w:t>
+      </w:r>
+    </w:p>
+    <w:p>
+      <w:pPr>
+        <w:pStyle w:val="ListBullet"/>
+      </w:pPr>
+      <w:r>
+        <w:t>Alert on disk space, file changes, or service failures inside the VM</w:t>
+      </w:r>
+    </w:p>
+    <w:p>
+      <w:r>
+        <w:rPr>
+          <w:b w:val="0"/>
+          <w:i w:val="0"/>
+        </w:rPr>
+        <w:t>For VMs that are simply running workloads where the KubeVirt-level CPU/memory/network metrics are sufficient, the platform DataSources from this guide provide everything you need without the overhead of a per-VM Collector.</w:t>
+      </w:r>
+    </w:p>
+    <w:p>
+      <w:r>
+        <w:br w:type="page"/>
+      </w:r>
+    </w:p>
+    <w:p>
+      <w:pPr>
+        <w:pStyle w:val="Heading1"/>
+      </w:pPr>
+      <w:r>
+        <w:t>17. Troubleshooting</w:t>
       </w:r>
     </w:p>
     <w:p>
@@ -4576,7 +5181,7 @@
               <w:rPr>
                 <w:sz w:val="20"/>
               </w:rPr>
-              <w:t>Generate a new token (Step 4)</w:t>
+              <w:t>Generate a new token (Section 7)</w:t>
             </w:r>
           </w:p>
         </w:tc>
@@ -4617,7 +5222,7 @@
               <w:rPr>
                 <w:sz w:val="20"/>
               </w:rPr>
-              <w:t>Re-run Step 3.2</w:t>
+              <w:t>Re-run Section 6.2</w:t>
             </w:r>
           </w:p>
         </w:tc>
@@ -4912,7 +5517,7 @@
         <w:pStyle w:val="ListBullet"/>
       </w:pPr>
       <w:r>
-        <w:t>The HTTP response code from the curl test in Step 5</w:t>
+        <w:t>The HTTP response code from the curl test in Section 8</w:t>
       </w:r>
     </w:p>
     <w:p>

</xml_diff>